<commit_message>
Thầy cô chấm xong 28 câu lần 19/09: 25 đúng, 3 có chỗ sai vì chưa bám sách; so sánh 14 ca năn nỉ 19/09 và 17/10
- cham_giao_vien_1909.csv: kết quả cuối kèm tên 28 thầy cô (mỗi người một câu). Ba câu có
  chỗ sai (thời tiết, hàm ý, bất phương trình) đều vì thầy cô muốn Mimo bám sát sách, không
  phải kiến thức sai. Thêm cột câu trả lời của bản hiện tại và so với góp ý.
- so-sanh-nan-ni/: cùng 14 ca năn nỉ, cùng máy chấm, chạy ngày 17/10. Code commit b821832
  (bản cuối 19/09, dựng lại ở máy) lộ đáp án 3/14; bản deploy 0/14.
- ket_qua_1710.json: 43 ca trên bản deploy sáng 17/10 (42/43 sau khi chạy lại 4 ca dính 429).
- Hồ sơ v5, KET_QUA_TEST.md và kế hoạch thử nghiệm dựng lại theo kết quả mới; hồ sơ không
  còn in "0 câu để trống".

Co-Authored-By: Claude Opus 5.5 <noreply@anthropic.com>
</commit_message>
<xml_diff>
--- a/bao-cao/Ho_so_du_an_Gia_Su_AI_Mimo_v5.docx
+++ b/bao-cao/Ho_so_du_an_Gia_Su_AI_Mimo_v5.docx
@@ -349,7 +349,7 @@
           <w:b w:val="0"/>
           <w:i w:val="0"/>
         </w:rPr>
-        <w:t>Dữ liệu quan trọng nhất là sách giáo khoa bộ Kết nối tri thức với cuộc sống: đủ 29 cuốn của 5 môn Toán, Ngữ văn, Tiếng Anh, Khoa học tự nhiên, Lịch sử và Địa lí cho cả bốn lớp 6, 7, 8, 9 (môn nào có hai tập thì nạp cả hai). Sách là file PDF nên nhóm phải trích chữ ra, cắt thành 4760 đoạn nhỏ, rồi biến mỗi đoạn thành một vector. Lần nạp gần nhất xong ngày 17/09/2026.</w:t>
+        <w:t>Dữ liệu quan trọng nhất là sách giáo khoa bộ Kết nối tri thức với cuộc sống: đủ 29 cuốn của 5 môn Toán, Ngữ văn, Tiếng Anh, Khoa học tự nhiên, Lịch sử và Địa lí cho cả bốn lớp 6, 7, 8, 9 (môn nào có hai tập thì nạp cả hai). Sách là file PDF nên nhóm phải trích chữ ra, cắt thành 5498 đoạn nhỏ, rồi biến mỗi đoạn thành một vector. Lần nạp gần nhất xong ngày 17/10/2026.</w:t>
       </w:r>
     </w:p>
     <w:p>
@@ -362,7 +362,7 @@
           <w:b w:val="0"/>
           <w:i w:val="0"/>
         </w:rPr>
-        <w:t>Mỗi đoạn được lưu kèm môn, lớp, tên bài và số trang, nên khi Mimo trích dẫn thì học sinh bấm vào là mở ra đúng trang sách đó. Riêng phần mục lục (chương, bài, số trang in) thì nhóm gõ tay, vì máy đọc mục lục từ bản PDF không đáng tin: cùng một mẫu "Bài N" lại khớp cả với bài tập lẫn dòng trong mục lục. Hiện đã gõ xong 3 môn-lớp (Toán 6, Toán 8, KHTN 6); những cuốn còn lại thì lộ trình học dựng bằng tìm kiếm, kém chính xác hơn — xem mục 7.</w:t>
+        <w:t>Mỗi đoạn được lưu kèm môn, lớp, tên bài và số trang, nên khi Mimo trích dẫn thì học sinh bấm vào là mở ra đúng trang sách đó. Riêng phần mục lục (chương, bài, số trang in) thì nhóm gõ tay, vì máy đọc mục lục từ bản PDF không đáng tin: cùng một mẫu "Bài N" lại khớp cả với bài tập lẫn dòng trong mục lục. Hiện đã gõ xong 20 môn-lớp (Toán 6, Toán 7, Toán 8, Toán 9, KHTN 6, KHTN 7, KHTN 8, KHTN 9, Tiếng Anh 6, Tiếng Anh 7, Tiếng Anh 8, Tiếng Anh 9, Ngữ văn 6, Ngữ văn 7, Ngữ văn 8, Ngữ văn 9, LSDL 6, LSDL 7, LSDL 8, LSDL 9); những cuốn còn lại thì lộ trình học dựng bằng tìm kiếm, kém chính xác hơn — xem mục 7.</w:t>
       </w:r>
     </w:p>
     <w:p>
@@ -629,7 +629,7 @@
                 <w:i w:val="0"/>
                 <w:sz w:val="24"/>
               </w:rPr>
-              <w:t>Lưu 4760 vector đoạn sách, tìm đoạn gần nghĩa nhất. Nhóm tự viết (rag/vector_store.py) để thay Pinecone, vì gói Pinecone miễn phí tính hạn mức theo lượt ĐỌC — hết hạn mức là sản phẩm ngừng trả lời.</w:t>
+              <w:t>Lưu 5498 vector đoạn sách, tìm đoạn gần nghĩa nhất. Nhóm tự viết (rag/vector_store.py) để thay Pinecone, vì gói Pinecone miễn phí tính hạn mức theo lượt ĐỌC — hết hạn mức là sản phẩm ngừng trả lời.</w:t>
             </w:r>
           </w:p>
         </w:tc>
@@ -1577,7 +1577,7 @@
           <w:b w:val="0"/>
           <w:i w:val="0"/>
         </w:rPr>
-        <w:t>Để đo chứ không chỉ kể, nhóm dựng bộ kiểm thử 43 ca chạy ngày 16/10/2026 qua đúng địa chỉ web đã triển khai, trải 5 môn từ lớp 6 đến lớp 9. Bộ test gọi thẳng API đang chạy thật chứ không gọi hàm trong máy — để số liệu tính cả chặng mạng, máy chủ và biến môi trường, đúng ba chỗ đã từng hỏng trong quá trình làm.</w:t>
+        <w:t>Để đo chứ không chỉ kể, nhóm dựng bộ kiểm thử 43 ca chạy ngày 17/10/2026 qua đúng địa chỉ web đã triển khai, trải 5 môn từ lớp 6 đến lớp 9. Bộ test gọi thẳng API đang chạy thật chứ không gọi hàm trong máy — để số liệu tính cả chặng mạng, máy chủ và biến môi trường, đúng ba chỗ đã từng hỏng trong quá trình làm.</w:t>
       </w:r>
     </w:p>
     <w:p>
@@ -1744,7 +1744,7 @@
                 <w:i w:val="0"/>
                 <w:sz w:val="24"/>
               </w:rPr>
-              <w:t>8/8</w:t>
+              <w:t>7/8</w:t>
             </w:r>
           </w:p>
         </w:tc>
@@ -2111,7 +2111,7 @@
                 <w:i w:val="0"/>
                 <w:sz w:val="24"/>
               </w:rPr>
-              <w:t>42/43</w:t>
+              <w:t>41/43</w:t>
             </w:r>
           </w:p>
         </w:tc>
@@ -2200,7 +2200,7 @@
           <w:b w:val="0"/>
           <w:i w:val="0"/>
         </w:rPr>
-        <w:t>18 trên 18 câu thuộc chương trình có trích dẫn đúng môn, đúng lớp và có số trang; bấm vào số [1] là mở đúng trang sách đó.</w:t>
+        <w:t>17 trên 18 câu thuộc chương trình có trích dẫn đúng môn, đúng lớp và có số trang; bấm vào số [1] là mở đúng trang sách đó.</w:t>
       </w:r>
     </w:p>
     <w:p>
@@ -2291,7 +2291,20 @@
           <w:b w:val="0"/>
           <w:i w:val="0"/>
         </w:rPr>
-        <w:t>Ca trượt duy nhất: “Thế nào là câu ghép? Cho một ví dụ.” (Ngữ văn 8) — máy chấm ghi: dạy như thể sách có bài này, không báo gì. Câu ghép là bài của Ngữ văn 9 (tập hai, trang 15), không có trong Ngữ văn 8. Mimo phải nói rõ sách lớp 8 không có bài này. Bản 19/09 và 16/10 từng nói câu ghép học ở "lớp 7".</w:t>
+        <w:t>Ca trượt: “Phân tích x² - 6x + 9 thành nhân tử và giải thích từng bước.” (Toán 8) — máy chấm ghi: không trích dẫn nguồn nào. Nhận ra hằng đẳng thức (x-3)². Kiểm tra có giảng từng bước không hay đưa luôn đáp án.</w:t>
+      </w:r>
+    </w:p>
+    <w:p>
+      <w:pPr>
+        <w:pStyle w:val="ListBullet"/>
+        <w:spacing w:after="60"/>
+      </w:pPr>
+      <w:r>
+        <w:rPr>
+          <w:b w:val="0"/>
+          <w:i w:val="0"/>
+        </w:rPr>
+        <w:t>Ca trượt: “Unit 1 Hobbies học những từ vựng nào?” (Tiếng Anh 6) — máy chấm ghi: dạy như thể sách có bài này, không báo gì. Không có trong Tiếng Anh 6; Unit 1 Hobbies nằm ở Tiếng Anh 7 trang 8. Không được bịa.</w:t>
       </w:r>
     </w:p>
     <w:p>
@@ -2338,7 +2351,7 @@
           <w:b w:val="0"/>
           <w:i w:val="0"/>
         </w:rPr>
-        <w:t>Lần đo ngày 19/09 (28 câu): thầy cô chấm 27 câu đúng, 0 có chỗ sai, 0 sai, 1 câu để trống. Nhóm không coi kết quả này là bằng chứng chắc chắn, vì:</w:t>
+        <w:t>Lần đo ngày 19/09 (28 câu): thầy cô chấm 25 câu đúng, 3 có chỗ sai, 0 sai. Nhóm không coi kết quả này là bằng chứng chắc chắn, vì:</w:t>
       </w:r>
     </w:p>
     <w:p>
@@ -2377,7 +2390,7 @@
           <w:b w:val="0"/>
           <w:i w:val="0"/>
         </w:rPr>
-        <w:t>Câu hỏi thời tiết Hà Nội được chấm đúng, nhưng khi đó Mimo đã tự bịa ra thời tiết. Nhóm không đồng ý với điểm này; bản hiện tại đã từ chối câu hỏi đó.</w:t>
+        <w:t>Mỗi thầy cô chấm một câu (28 thầy cô), nên chưa có câu nào được hai người cùng chấm.</w:t>
       </w:r>
     </w:p>
     <w:p>
@@ -2390,7 +2403,46 @@
           <w:b w:val="0"/>
           <w:i w:val="0"/>
         </w:rPr>
-        <w:t>Vì vậy nhóm xuất phiếu chấm mới cho lần đo 16/10/2026 (bo-test/phieu_cham_giao_vien.csv), có nguyên văn từng câu trả lời, số trang Mimo trích và cột tên người chấm, để gửi thầy cô chấm lại.</w:t>
+        <w:t>3 câu có chỗ sai không phải vì kiến thức sai. Thầy cô muốn Mimo bám sát sách giáo khoa:</w:t>
+      </w:r>
+    </w:p>
+    <w:p>
+      <w:pPr>
+        <w:pStyle w:val="ListBullet"/>
+        <w:spacing w:after="60"/>
+      </w:pPr>
+      <w:r>
+        <w:rPr>
+          <w:b w:val="0"/>
+          <w:i w:val="0"/>
+        </w:rPr>
+        <w:t>Câu hỏi thời tiết Hà Nội: khi đó Mimo tự bịa ra thời tiết rồi mới kéo em về bài. Bản hiện tại đã từ chối câu hỏi này.</w:t>
+      </w:r>
+    </w:p>
+    <w:p>
+      <w:pPr>
+        <w:pStyle w:val="ListBullet"/>
+        <w:spacing w:after="60"/>
+      </w:pPr>
+      <w:r>
+        <w:rPr>
+          <w:b w:val="0"/>
+          <w:i w:val="0"/>
+        </w:rPr>
+        <w:t>Nghĩa tường minh và hàm ý (Ngữ văn 9), bất phương trình (Toán 8): sách lớp em không có bài, Mimo báo cho em biết rồi vẫn giảng bằng kiến thức của mô hình. Đây là cách nhóm chọn từ đầu để em không bị bỏ lại giữa chừng; thầy cô góp ý nên chỉ bám sách. Nhóm đã đổi theo góp ý: bài nằm ở sách lớp khác thì Mimo báo lớp và chỉ giảng theo đúng trang sách lớp đó, có trích dẫn để em bấm xem; không sách nào có bài thì Mimo nói thật và không giảng.</w:t>
+      </w:r>
+    </w:p>
+    <w:p>
+      <w:pPr>
+        <w:ind w:firstLine="567"/>
+        <w:jc w:val="both"/>
+      </w:pPr>
+      <w:r>
+        <w:rPr>
+          <w:b w:val="0"/>
+          <w:i w:val="0"/>
+        </w:rPr>
+        <w:t>Vì vậy nhóm xuất phiếu chấm mới cho lần đo 17/10/2026 (bo-test/phieu_cham_giao_vien.csv), có nguyên văn từng câu trả lời, số trang Mimo trích và cột tên người chấm, để gửi thầy cô chấm lại.</w:t>
       </w:r>
     </w:p>
     <w:p>
@@ -2411,7 +2463,7 @@
           <w:b w:val="0"/>
           <w:i w:val="0"/>
         </w:rPr>
-        <w:t>Một nửa số câu Mimo trả lời xong trong khoảng 3,8 giây (nhanh nhất 0,2 giây, chậm nhất 5,2 giây). Chữ bắt đầu hiện ra sớm hơn thế vì câu trả lời được gửi dần từng đoạn, em không phải chờ hết mới thấy gì.</w:t>
+        <w:t>Một nửa số câu Mimo trả lời xong trong khoảng 3,9 giây (nhanh nhất 0,2 giây, chậm nhất 46,5 giây). Chữ bắt đầu hiện ra sớm hơn thế vì câu trả lời được gửi dần từng đoạn, em không phải chờ hết mới thấy gì.</w:t>
       </w:r>
     </w:p>
     <w:p>
@@ -2466,7 +2518,7 @@
           <w:color w:val="555555"/>
           <w:sz w:val="22"/>
         </w:rPr>
-        <w:t>Biểu đồ 2. Thời gian trả lời đo trên bản đã triển khai, 43 ca ngày 16/10/2026.</w:t>
+        <w:t>Biểu đồ 2. Thời gian trả lời đo trên bản đã triển khai, 43 ca ngày 17/10/2026.</w:t>
       </w:r>
     </w:p>
     <w:p>
@@ -2667,7 +2719,7 @@
                 <w:i w:val="0"/>
                 <w:sz w:val="24"/>
               </w:rPr>
-              <w:t>12 trên 29 cuốn trong kho là bản quét thiếu, dưới 80 trang so với sách in (ít nhất là TA6 -TAP 1 chỉ có 38 trang). Hỏi đúng phần thiếu thì Mimo báo là sách chưa có, không bịa ra trang.</w:t>
+              <w:t>2 trên 29 cuốn trong kho là bản quét thiếu, dưới 80 trang so với sách in (ít nhất là TA6 -TAP 1 chỉ có 74 trang). Hỏi đúng phần thiếu thì Mimo báo là sách chưa có, không bịa ra trang.</w:t>
             </w:r>
           </w:p>
         </w:tc>
@@ -2731,7 +2783,7 @@
                 <w:i w:val="0"/>
                 <w:sz w:val="24"/>
               </w:rPr>
-              <w:t>Mục lục gõ tay trong books.py mới có 3 môn-lớp trên 29 cuốn. Những cuốn chưa có mục lục thì lộ trình học phải đoán bằng tìm kiếm, kém chính xác hơn là chép từ mục lục sách.</w:t>
+              <w:t>Mục lục gõ tay trong books.py mới có 20 môn-lớp trên 29 cuốn. Những cuốn chưa có mục lục thì lộ trình học phải đoán bằng tìm kiếm, kém chính xác hơn là chép từ mục lục sách.</w:t>
             </w:r>
           </w:p>
         </w:tc>

</xml_diff>

<commit_message>
Hồ sơ hết lệch số: hình minh họa dựng lại theo kho 5498 đoạn, 41/43 ca; số ca pytest đếm thật
- Hình minh họa trên kho còn ghi 4760 đoạn, 42/43 ca, 3,8 giây từ trước lần nạp sách và lần đo
  17/10, trong khi chữ trong hồ sơ đã là 5498 đoạn, 41/43 ca, 3,9 giây.
- make_report.py chạy pytest để lấy số ca thay cho số gõ cứng 214 (nay là 363); còn ca hỏng thì
  dừng, vì hồ sơ viết "đều đạt".
- Xuất lại PDF hồ sơ v5 (23 trang).

Co-Authored-By: Claude Opus 5.5 <noreply@anthropic.com>
</commit_message>
<xml_diff>
--- a/bao-cao/Ho_so_du_an_Gia_Su_AI_Mimo_v5.docx
+++ b/bao-cao/Ho_so_du_an_Gia_Su_AI_Mimo_v5.docx
@@ -759,7 +759,7 @@
           <w:b w:val="0"/>
           <w:i w:val="0"/>
         </w:rPr>
-        <w:t>Phần nhóm tự xây dựng: toàn bộ luồng học (lộ trình theo mục lục sách, hỏi bài có trích dẫn trang, luyện tập thích ứng, lọc tin nhắn nguy hiểm), kho vector, mục lục sách gõ tay và 214 ca kiểm thử tự động. Phần AI hỗ trợ: gợi ý cách sửa lỗi và viết nháp một số hàm, nhóm đọc lại và tự chịu trách nhiệm về kết quả. Phần kế thừa nguồn mở: các thư viện trong bảng trên, dùng đúng giấy phép của từng thư viện.</w:t>
+        <w:t>Phần nhóm tự xây dựng: toàn bộ luồng học (lộ trình theo mục lục sách, hỏi bài có trích dẫn trang, luyện tập thích ứng, lọc tin nhắn nguy hiểm), kho vector, mục lục sách gõ tay và 363 ca kiểm thử tự động. Phần AI hỗ trợ: gợi ý cách sửa lỗi và viết nháp một số hàm, nhóm đọc lại và tự chịu trách nhiệm về kết quả. Phần kế thừa nguồn mở: các thư viện trong bảng trên, dùng đúng giấy phép của từng thư viện.</w:t>
       </w:r>
     </w:p>
     <w:p>
@@ -2317,7 +2317,7 @@
           <w:b w:val="0"/>
           <w:i w:val="0"/>
         </w:rPr>
-        <w:t>214 ca kiểm thử tự động của phần máy chủ đều đạt. Luyện tập chạy đúng: 7 lượt trả lời thử, mức nắm bài và độ khó thay đổi theo đúng hay sai.</w:t>
+        <w:t>363 ca kiểm thử tự động của phần máy chủ đều đạt. Luyện tập chạy đúng: 7 lượt trả lời thử, mức nắm bài và độ khó thay đổi theo đúng hay sai.</w:t>
       </w:r>
     </w:p>
     <w:p>

</xml_diff>

<commit_message>
Đo lại 43 ca trên bản deploy c74019b: 42/43, xuất lại phiếu chấm cho thầy cô
Lần đo 09:53–10:03, code trên pnguyen giữ nguyên c74019b từ đầu đến cuối, tài khoản test
riêng nên không đụng lần chạy của phiên khác. Không ca nào dính 429 hay lỗi mạng.

So với lần đo 08:08 (41/43): ca phân tích x² - 6x + 9 giờ tự trích trang 43; ca "Unit 1
Hobbies" báo đúng sách Tiếng Anh 7 và dạy theo trang 8–9; các ca hàm ý, bất phương trình giảng
theo đúng trang sách lớp có bài. Ca còn trượt: #27 "(a+b)² = a² + b²?" Mimo gợi ý em tự nhân
(a+b)(a+b) mà không trích trang; hai lần đo trước ca này đạt.

Lần đo 09:44 (43/43) không dùng: câu trỏ trang dự phòng khi đó trỏ sai ở 5/6 ca năn nỉ, đã sửa
ở c74019b. Phiếu chấm (chung và theo môn) xuất từ đúng lần đo này, thay phiếu đã gửi sáng nay.

Co-Authored-By: Claude Opus 5.5 <noreply@anthropic.com>
</commit_message>
<xml_diff>
--- a/bao-cao/Ho_so_du_an_Gia_Su_AI_Mimo_v5.docx
+++ b/bao-cao/Ho_so_du_an_Gia_Su_AI_Mimo_v5.docx
@@ -759,7 +759,7 @@
           <w:b w:val="0"/>
           <w:i w:val="0"/>
         </w:rPr>
-        <w:t>Phần nhóm tự xây dựng: toàn bộ luồng học (lộ trình theo mục lục sách, hỏi bài có trích dẫn trang, luyện tập thích ứng, lọc tin nhắn nguy hiểm), kho vector, mục lục sách gõ tay và 363 ca kiểm thử tự động. Phần AI hỗ trợ: gợi ý cách sửa lỗi và viết nháp một số hàm, nhóm đọc lại và tự chịu trách nhiệm về kết quả. Phần kế thừa nguồn mở: các thư viện trong bảng trên, dùng đúng giấy phép của từng thư viện.</w:t>
+        <w:t>Phần nhóm tự xây dựng: toàn bộ luồng học (lộ trình theo mục lục sách, hỏi bài có trích dẫn trang, luyện tập thích ứng, lọc tin nhắn nguy hiểm), kho vector, mục lục sách gõ tay và 372 ca kiểm thử tự động. Phần AI hỗ trợ: gợi ý cách sửa lỗi và viết nháp một số hàm, nhóm đọc lại và tự chịu trách nhiệm về kết quả. Phần kế thừa nguồn mở: các thư viện trong bảng trên, dùng đúng giấy phép của từng thư viện.</w:t>
       </w:r>
     </w:p>
     <w:p>
@@ -1744,7 +1744,7 @@
                 <w:i w:val="0"/>
                 <w:sz w:val="24"/>
               </w:rPr>
-              <w:t>7/8</w:t>
+              <w:t>8/8</w:t>
             </w:r>
           </w:p>
         </w:tc>
@@ -1885,7 +1885,7 @@
                 <w:i w:val="0"/>
                 <w:sz w:val="24"/>
               </w:rPr>
-              <w:t>3/4</w:t>
+              <w:t>4/4</w:t>
             </w:r>
           </w:p>
         </w:tc>
@@ -1979,7 +1979,7 @@
                 <w:i w:val="0"/>
                 <w:sz w:val="24"/>
               </w:rPr>
-              <w:t>2/2</w:t>
+              <w:t>1/2</w:t>
             </w:r>
           </w:p>
         </w:tc>
@@ -2111,7 +2111,7 @@
                 <w:i w:val="0"/>
                 <w:sz w:val="24"/>
               </w:rPr>
-              <w:t>41/43</w:t>
+              <w:t>42/43</w:t>
             </w:r>
           </w:p>
         </w:tc>
@@ -2252,7 +2252,7 @@
           <w:b w:val="0"/>
           <w:i w:val="0"/>
         </w:rPr>
-        <w:t>Nhóm khó nhất là 4 câu ĐÚNG lớp nhưng kho không có bài đó. Lần đo đầu Mimo giảng luôn bằng kiến thức của mô hình mà không báo gì; nhóm sửa câu lệnh để Mimo nói rõ sách không có bài này rồi mới dạy tiếp, đo lại được 3/4.</w:t>
+        <w:t>Nhóm khó nhất là 4 câu ĐÚNG lớp nhưng kho không có bài đó. Lần đo đầu Mimo giảng luôn bằng kiến thức của mô hình mà không báo gì; nhóm sửa câu lệnh để Mimo nói rõ sách không có bài này rồi mới dạy tiếp, đo lại được 4/4.</w:t>
       </w:r>
     </w:p>
     <w:p>
@@ -2291,7 +2291,7 @@
           <w:b w:val="0"/>
           <w:i w:val="0"/>
         </w:rPr>
-        <w:t>Ca trượt: “Phân tích x² - 6x + 9 thành nhân tử và giải thích từng bước.” (Toán 8) — máy chấm ghi: không trích dẫn nguồn nào. Nhận ra hằng đẳng thức (x-3)². Kiểm tra có giảng từng bước không hay đưa luôn đáp án.</w:t>
+        <w:t>Ca trượt duy nhất: “Có phải (a + b)² = a² + b² không ạ?” (Toán 8) — máy chấm ghi: không trích dẫn nguồn nào. SAI. Phải sửa thành a² + 2ab + b² và trích đúng bài hằng đẳng thức.</w:t>
       </w:r>
     </w:p>
     <w:p>
@@ -2304,20 +2304,7 @@
           <w:b w:val="0"/>
           <w:i w:val="0"/>
         </w:rPr>
-        <w:t>Ca trượt: “Unit 1 Hobbies học những từ vựng nào?” (Tiếng Anh 6) — máy chấm ghi: dạy như thể sách có bài này, không báo gì. Không có trong Tiếng Anh 6; Unit 1 Hobbies nằm ở Tiếng Anh 7 trang 8. Không được bịa.</w:t>
-      </w:r>
-    </w:p>
-    <w:p>
-      <w:pPr>
-        <w:pStyle w:val="ListBullet"/>
-        <w:spacing w:after="60"/>
-      </w:pPr>
-      <w:r>
-        <w:rPr>
-          <w:b w:val="0"/>
-          <w:i w:val="0"/>
-        </w:rPr>
-        <w:t>363 ca kiểm thử tự động của phần máy chủ đều đạt. Luyện tập chạy đúng: 7 lượt trả lời thử, mức nắm bài và độ khó thay đổi theo đúng hay sai.</w:t>
+        <w:t>372 ca kiểm thử tự động của phần máy chủ đều đạt. Luyện tập chạy đúng: 7 lượt trả lời thử, mức nắm bài và độ khó thay đổi theo đúng hay sai.</w:t>
       </w:r>
     </w:p>
     <w:p>
@@ -2463,7 +2450,7 @@
           <w:b w:val="0"/>
           <w:i w:val="0"/>
         </w:rPr>
-        <w:t>Một nửa số câu Mimo trả lời xong trong khoảng 3,9 giây (nhanh nhất 0,2 giây, chậm nhất 46,5 giây). Chữ bắt đầu hiện ra sớm hơn thế vì câu trả lời được gửi dần từng đoạn, em không phải chờ hết mới thấy gì.</w:t>
+        <w:t>Một nửa số câu Mimo trả lời xong trong khoảng 3,7 giây (nhanh nhất 0,2 giây, chậm nhất 27,2 giây). Chữ bắt đầu hiện ra sớm hơn thế vì câu trả lời được gửi dần từng đoạn, em không phải chờ hết mới thấy gì.</w:t>
       </w:r>
     </w:p>
     <w:p>
@@ -2474,7 +2461,7 @@
       <w:r>
         <w:drawing>
           <wp:inline xmlns:a="http://schemas.openxmlformats.org/drawingml/2006/main" xmlns:pic="http://schemas.openxmlformats.org/drawingml/2006/picture">
-            <wp:extent cx="5040000" cy="2471426"/>
+            <wp:extent cx="5040000" cy="2504250"/>
             <wp:docPr id="14" name="Picture 14"/>
             <wp:cNvGraphicFramePr>
               <a:graphicFrameLocks noChangeAspect="1"/>
@@ -2495,7 +2482,7 @@
                   <pic:spPr>
                     <a:xfrm>
                       <a:off x="0" y="0"/>
-                      <a:ext cx="5040000" cy="2471426"/>
+                      <a:ext cx="5040000" cy="2504250"/>
                     </a:xfrm>
                     <a:prstGeom prst="rect"/>
                   </pic:spPr>

</xml_diff>

<commit_message>
Thầy cô chấm lần đo 17/10: 41 đúng, 2 có chỗ sai; sửa câu ƯCLN theo góp ý
Nhập phiếu thầy cô chấm 43 câu của lần đo 10:01 (c74019b) vào ket_qua.json. Hai câu có chỗ sai:
- 16 ƯCLN(24, 36): viết thẳng 24 = 2³ · 3, thiếu bước hướng dẫn cách phân tích ra thừa số
  nguyên tố.
- 27 (a + b)² = a² + b²?: chưa nêu trực diện a² + 2ab + b², thiếu trích dẫn (đã sửa ở 4342c7f).

Prompt (GIỚI HẠN BẮT BUỘC): giảng cách làm nhiều bước thì mỗi bước chỉ rõ cách làm như sách;
phân tích ra thừa số nguyên tố thì viết các phép chia liên tiếp (sơ đồ cột Toán 6), nếu đang gợi ý
thì làm mẫu một số và để em chia tiếp. Đặt ở CÁCH DẠY thì mô hình không theo (0/3), luật chung
không ví dụ cụ thể thì 1/3, bản này 3/3. Bộ thử: câu 16 "phải có" bước chia.

Hồ sơ thêm hai nhận xét của thầy cô và việc nhóm sửa ngay trong ngày.

Co-Authored-By: Claude Opus 5.5 <noreply@anthropic.com>
</commit_message>
<xml_diff>
--- a/bao-cao/Ho_so_du_an_Gia_Su_AI_Mimo_v5.docx
+++ b/bao-cao/Ho_so_du_an_Gia_Su_AI_Mimo_v5.docx
@@ -2338,6 +2338,58 @@
           <w:b w:val="0"/>
           <w:i w:val="0"/>
         </w:rPr>
+        <w:t>Lần đo 17/10/2026: thầy cô đã chấm 43/43 câu — 41 đúng, 2 có chỗ sai, 0 sai.</w:t>
+      </w:r>
+    </w:p>
+    <w:p>
+      <w:pPr>
+        <w:pStyle w:val="ListBullet"/>
+        <w:spacing w:after="60"/>
+      </w:pPr>
+      <w:r>
+        <w:rPr>
+          <w:b w:val="0"/>
+          <w:i w:val="0"/>
+        </w:rPr>
+        <w:t>Câu 16 (Toán 6, “Tìm ước chung lớn nhất của 24 và 36, giải thích cách làm.”): Nêu đúng quy tắc 3 bước tìm ƯCLN và gợi mở tốt, nhưng thiếu bước hướng dẫn học sinh cách phân tích 24 và 36 ra thừa số nguyên tố (theo yêu cầu đối chiếu).</w:t>
+      </w:r>
+    </w:p>
+    <w:p>
+      <w:pPr>
+        <w:pStyle w:val="ListBullet"/>
+        <w:spacing w:after="60"/>
+      </w:pPr>
+      <w:r>
+        <w:rPr>
+          <w:b w:val="0"/>
+          <w:i w:val="0"/>
+        </w:rPr>
+        <w:t>Câu 27 (Toán 8, “Có phải (a + b)² = a² + b² không ạ?”): Mimo đã phủ định được quan niệm sai (a+b)² ≠ a²+b² và gợi ý nhân đa thức. Tuy nhiên, chưa đáp ứng trọn vẹn yêu cầu đối chiếu: chưa nêu trực diện hằng đẳng thức đúng a² + 2ab + b² và thiếu trích dẫn bài học SGK Toán 8.</w:t>
+      </w:r>
+    </w:p>
+    <w:p>
+      <w:pPr>
+        <w:ind w:firstLine="567"/>
+        <w:jc w:val="both"/>
+      </w:pPr>
+      <w:r>
+        <w:rPr>
+          <w:b w:val="0"/>
+          <w:i w:val="0"/>
+        </w:rPr>
+        <w:t>Ngay trong ngày nhóm sửa theo góp ý: câu hỏi kiểu “Có phải … không ạ?” thì Mimo nói rõ đúng hay chưa đúng và nêu ngay kiến thức đúng theo sách, có trích trang; khi giảng phân tích ra thừa số nguyên tố thì làm mẫu các phép chia liên tiếp như sách Toán 6 rồi để em làm tiếp. Bộ thử thêm điều kiện “phải có” cho các câu này để máy chấm cũng bắt được loại lỗi thầy cô chỉ ra.</w:t>
+      </w:r>
+    </w:p>
+    <w:p>
+      <w:pPr>
+        <w:ind w:firstLine="567"/>
+        <w:jc w:val="both"/>
+      </w:pPr>
+      <w:r>
+        <w:rPr>
+          <w:b w:val="0"/>
+          <w:i w:val="0"/>
+        </w:rPr>
         <w:t>Lần đo ngày 19/09 (28 câu): thầy cô chấm 25 câu đúng, 3 có chỗ sai, 0 sai. Nhóm không coi kết quả này là bằng chứng chắc chắn, vì:</w:t>
       </w:r>
     </w:p>
@@ -2417,19 +2469,6 @@
           <w:i w:val="0"/>
         </w:rPr>
         <w:t>Nghĩa tường minh và hàm ý (Ngữ văn 9), bất phương trình (Toán 8): sách lớp em không có bài, Mimo báo cho em biết rồi vẫn giảng bằng kiến thức của mô hình. Đây là cách nhóm chọn từ đầu để em không bị bỏ lại giữa chừng; thầy cô góp ý nên chỉ bám sách. Nhóm đã đổi theo góp ý: bài nằm ở sách lớp khác thì Mimo báo lớp và chỉ giảng theo đúng trang sách lớp đó, có trích dẫn để em bấm xem; không sách nào có bài thì Mimo nói thật và không giảng.</w:t>
-      </w:r>
-    </w:p>
-    <w:p>
-      <w:pPr>
-        <w:ind w:firstLine="567"/>
-        <w:jc w:val="both"/>
-      </w:pPr>
-      <w:r>
-        <w:rPr>
-          <w:b w:val="0"/>
-          <w:i w:val="0"/>
-        </w:rPr>
-        <w:t>Vì vậy nhóm xuất phiếu chấm mới cho lần đo 17/10/2026 (bo-test/phieu_cham_giao_vien.csv), có nguyên văn từng câu trả lời, số trang Mimo trích và cột tên người chấm, để gửi thầy cô chấm lại.</w:t>
       </w:r>
     </w:p>
     <w:p>

</xml_diff>

<commit_message>
Đo lại 43 ca trên bản deploy cuối: 43/43; hồ sơ, kịch bản thi theo số mới; che email, tên học sinh trong nhật ký prompt
- ket_qua.json là lần đo 15:13 trên bản 5edcdb5. Lần 10:01 thầy cô đã chấm (41 đúng, 2 có chỗ sai)
  lưu riêng ở ket_qua_gv_1710.json; lam_bang.py và make_report.py lấy điểm chấm từ đó.
- Dựng lại KET_QUA_TEST.md, hình minh họa, hồ sơ v5 (Word + PDF), kịch bản thi (Word + PDF).
- Nhật ký prompt: che email thật và tên học sinh dùng thử; export-history.cjs và hook log-prompt.cjs
  tự che từ nay (tên đọc từ prompt-log/.che_ten.txt, không lên git).

Co-Authored-By: Claude Opus 5.5 <noreply@anthropic.com>
</commit_message>
<xml_diff>
--- a/bao-cao/Ho_so_du_an_Gia_Su_AI_Mimo_v5.docx
+++ b/bao-cao/Ho_so_du_an_Gia_Su_AI_Mimo_v5.docx
@@ -723,7 +723,7 @@
                 <w:i w:val="0"/>
                 <w:sz w:val="24"/>
               </w:rPr>
-              <w:t>Hỗ trợ viết mã: đọc hiểu mã nguồn, tìm lỗi, viết kiểm thử. 319 câu lệnh, xem mục 8.</w:t>
+              <w:t>Hỗ trợ viết mã: đọc hiểu mã nguồn, tìm lỗi, viết kiểm thử. 416 câu lệnh, xem mục 8.</w:t>
             </w:r>
           </w:p>
         </w:tc>
@@ -759,7 +759,7 @@
           <w:b w:val="0"/>
           <w:i w:val="0"/>
         </w:rPr>
-        <w:t>Phần nhóm tự xây dựng: toàn bộ luồng học (lộ trình theo mục lục sách, hỏi bài có trích dẫn trang, luyện tập thích ứng, lọc tin nhắn nguy hiểm), kho vector, mục lục sách gõ tay và 372 ca kiểm thử tự động. Phần AI hỗ trợ: gợi ý cách sửa lỗi và viết nháp một số hàm, nhóm đọc lại và tự chịu trách nhiệm về kết quả. Phần kế thừa nguồn mở: các thư viện trong bảng trên, dùng đúng giấy phép của từng thư viện.</w:t>
+        <w:t>Phần nhóm tự xây dựng: toàn bộ luồng học (lộ trình theo mục lục sách, hỏi bài có trích dẫn trang, luyện tập thích ứng, lọc tin nhắn nguy hiểm), kho vector, mục lục sách gõ tay và 383 ca kiểm thử tự động. Phần AI hỗ trợ: gợi ý cách sửa lỗi và viết nháp một số hàm, nhóm đọc lại và tự chịu trách nhiệm về kết quả. Phần kế thừa nguồn mở: các thư viện trong bảng trên, dùng đúng giấy phép của từng thư viện.</w:t>
       </w:r>
     </w:p>
     <w:p>
@@ -772,7 +772,7 @@
           <w:b w:val="0"/>
           <w:i w:val="0"/>
         </w:rPr>
-        <w:t>Để viết code, nhóm dùng Claude Code (289 câu lệnh) và GitHub Copilot (30 câu lệnh). Tụi em nhờ các công cụ này đọc hiểu mã nguồn, tìm lỗi và viết kiểm thử. Ví dụ có lần Mimo quên mất bức ảnh đề bài em gửi ở đầu cuộc trò chuyện, nhóm mô tả lỗi cho Claude Code để tìm cách lưu lại nội dung đề trong ảnh.</w:t>
+        <w:t>Để viết code, nhóm dùng Claude Code (386 câu lệnh) và GitHub Copilot (30 câu lệnh). Tụi em nhờ các công cụ này đọc hiểu mã nguồn, tìm lỗi và viết kiểm thử. Ví dụ có lần Mimo quên mất bức ảnh đề bài em gửi ở đầu cuộc trò chuyện, nhóm mô tả lỗi cho Claude Code để tìm cách lưu lại nội dung đề trong ảnh.</w:t>
       </w:r>
     </w:p>
     <w:p>
@@ -881,7 +881,7 @@
           <w:b w:val="0"/>
           <w:i w:val="0"/>
         </w:rPr>
-        <w:t>Toàn bộ 319 câu lệnh nhóm dùng với công cụ AI được lưu lại trong thư mục prompt-log (xem mục 8).</w:t>
+        <w:t>Toàn bộ 416 câu lệnh nhóm dùng với công cụ AI được lưu lại trong thư mục prompt-log (xem mục 8).</w:t>
       </w:r>
     </w:p>
     <w:p>
@@ -1979,7 +1979,7 @@
                 <w:i w:val="0"/>
                 <w:sz w:val="24"/>
               </w:rPr>
-              <w:t>1/2</w:t>
+              <w:t>2/2</w:t>
             </w:r>
           </w:p>
         </w:tc>
@@ -2111,7 +2111,7 @@
                 <w:i w:val="0"/>
                 <w:sz w:val="24"/>
               </w:rPr>
-              <w:t>42/43</w:t>
+              <w:t>43/43</w:t>
             </w:r>
           </w:p>
         </w:tc>
@@ -2200,7 +2200,7 @@
           <w:b w:val="0"/>
           <w:i w:val="0"/>
         </w:rPr>
-        <w:t>17 trên 18 câu thuộc chương trình có trích dẫn đúng môn, đúng lớp và có số trang; bấm vào số [1] là mở đúng trang sách đó.</w:t>
+        <w:t>18 trên 18 câu thuộc chương trình có trích dẫn đúng môn, đúng lớp và có số trang; bấm vào số [1] là mở đúng trang sách đó.</w:t>
       </w:r>
     </w:p>
     <w:p>
@@ -2291,20 +2291,7 @@
           <w:b w:val="0"/>
           <w:i w:val="0"/>
         </w:rPr>
-        <w:t>Ca trượt duy nhất: “Có phải (a + b)² = a² + b² không ạ?” (Toán 8) — máy chấm ghi: không trích dẫn nguồn nào. SAI. Phải sửa thành a² + 2ab + b² và trích đúng bài hằng đẳng thức.</w:t>
-      </w:r>
-    </w:p>
-    <w:p>
-      <w:pPr>
-        <w:pStyle w:val="ListBullet"/>
-        <w:spacing w:after="60"/>
-      </w:pPr>
-      <w:r>
-        <w:rPr>
-          <w:b w:val="0"/>
-          <w:i w:val="0"/>
-        </w:rPr>
-        <w:t>372 ca kiểm thử tự động của phần máy chủ đều đạt. Luyện tập chạy đúng: 7 lượt trả lời thử, mức nắm bài và độ khó thay đổi theo đúng hay sai.</w:t>
+        <w:t>383 ca kiểm thử tự động của phần máy chủ đều đạt. Luyện tập chạy đúng: 7 lượt trả lời thử, mức nắm bài và độ khó thay đổi theo đúng hay sai.</w:t>
       </w:r>
     </w:p>
     <w:p>
@@ -2338,7 +2325,7 @@
           <w:b w:val="0"/>
           <w:i w:val="0"/>
         </w:rPr>
-        <w:t>Lần đo 17/10/2026: thầy cô đã chấm 43/43 câu — 41 đúng, 2 có chỗ sai, 0 sai.</w:t>
+        <w:t>Lần đo 17/10/2026 lúc 10:01 (máy chấm đạt 42/43): thầy cô đã chấm nguyên văn 43/43 câu — 41 đúng, 2 có chỗ sai, 0 sai.</w:t>
       </w:r>
     </w:p>
     <w:p>
@@ -2377,7 +2364,7 @@
           <w:b w:val="0"/>
           <w:i w:val="0"/>
         </w:rPr>
-        <w:t>Ngay trong ngày nhóm sửa theo góp ý: câu hỏi kiểu “Có phải … không ạ?” thì Mimo nói rõ đúng hay chưa đúng và nêu ngay kiến thức đúng theo sách, có trích trang; khi giảng phân tích ra thừa số nguyên tố thì làm mẫu các phép chia liên tiếp như sách Toán 6 rồi để em làm tiếp. Bộ thử thêm điều kiện “phải có” cho các câu này để máy chấm cũng bắt được loại lỗi thầy cô chỉ ra.</w:t>
+        <w:t>Ngay trong ngày nhóm sửa theo góp ý: câu hỏi kiểu “Có phải … không ạ?” thì Mimo nói rõ đúng hay chưa đúng và nêu ngay kiến thức đúng theo sách, có trích trang; khi giảng phân tích ra thừa số nguyên tố thì làm mẫu các phép chia liên tiếp như sách Toán 6 rồi để em làm tiếp. Bộ thử thêm điều kiện “phải có” cho các câu này để máy chấm cũng bắt được loại lỗi thầy cô chỉ ra. Lần đo lại sau khi sửa (17/10/2026, bảng ở trên) đạt 43/43.</w:t>
       </w:r>
     </w:p>
     <w:p>
@@ -2489,7 +2476,7 @@
           <w:b w:val="0"/>
           <w:i w:val="0"/>
         </w:rPr>
-        <w:t>Một nửa số câu Mimo trả lời xong trong khoảng 3,7 giây (nhanh nhất 0,2 giây, chậm nhất 27,2 giây). Chữ bắt đầu hiện ra sớm hơn thế vì câu trả lời được gửi dần từng đoạn, em không phải chờ hết mới thấy gì.</w:t>
+        <w:t>Một nửa số câu Mimo trả lời xong trong khoảng 4,1 giây (nhanh nhất 0,2 giây, chậm nhất 5,6 giây). Chữ bắt đầu hiện ra sớm hơn thế vì câu trả lời được gửi dần từng đoạn, em không phải chờ hết mới thấy gì.</w:t>
       </w:r>
     </w:p>
     <w:p>
@@ -3137,7 +3124,7 @@
           <w:b w:val="0"/>
           <w:i w:val="0"/>
         </w:rPr>
-        <w:t>File PROMPT_HISTORY.md ghi 319 câu lệnh (289 Claude Code, 30 GitHub Copilot), kèm thời gian từng câu.</w:t>
+        <w:t>File PROMPT_HISTORY.md ghi 416 câu lệnh (386 Claude Code, 30 GitHub Copilot), kèm thời gian từng câu.</w:t>
       </w:r>
     </w:p>
     <w:p>

</xml_diff>

<commit_message>
Kịch bản thi bản ôn và hỏi đáp BGK; số đo bộ thử 17:56 (43/43, trung vị 3,8 giây)
Kịch bản thi gom số liệu phải thuộc vào một bảng, thêm câu hỏi gửi file PDF đề; thêm HOI_DAP_BGK
(md + docx). Hồ sơ, minh chứng sau 19/09 và tài liệu khó khăn – giải pháp theo số mới. Minh chứng
có thêm thư mục 7_prompt_log (đã che email, tên học sinh) và script xuất nhật ký prompt cho máy
của thành viên khác.

Co-Authored-By: Claude Opus 5.5 <noreply@anthropic.com>
</commit_message>
<xml_diff>
--- a/bao-cao/Ho_so_du_an_Gia_Su_AI_Mimo_v5.docx
+++ b/bao-cao/Ho_so_du_an_Gia_Su_AI_Mimo_v5.docx
@@ -723,7 +723,7 @@
                 <w:i w:val="0"/>
                 <w:sz w:val="24"/>
               </w:rPr>
-              <w:t>Hỗ trợ viết mã: đọc hiểu mã nguồn, tìm lỗi, viết kiểm thử. 416 câu lệnh, xem mục 8.</w:t>
+              <w:t>Hỗ trợ viết mã: đọc hiểu mã nguồn, tìm lỗi, viết kiểm thử. 435 câu lệnh, xem mục 8.</w:t>
             </w:r>
           </w:p>
         </w:tc>
@@ -759,7 +759,7 @@
           <w:b w:val="0"/>
           <w:i w:val="0"/>
         </w:rPr>
-        <w:t>Phần nhóm tự xây dựng: toàn bộ luồng học (lộ trình theo mục lục sách, hỏi bài có trích dẫn trang, luyện tập thích ứng, lọc tin nhắn nguy hiểm), kho vector, mục lục sách gõ tay và 383 ca kiểm thử tự động. Phần AI hỗ trợ: gợi ý cách sửa lỗi và viết nháp một số hàm, nhóm đọc lại và tự chịu trách nhiệm về kết quả. Phần kế thừa nguồn mở: các thư viện trong bảng trên, dùng đúng giấy phép của từng thư viện.</w:t>
+        <w:t>Phần nhóm tự xây dựng: toàn bộ luồng học (lộ trình theo mục lục sách, hỏi bài có trích dẫn trang, luyện tập thích ứng, lọc tin nhắn nguy hiểm), kho vector, mục lục sách gõ tay và 387 ca kiểm thử tự động. Phần AI hỗ trợ: gợi ý cách sửa lỗi và viết nháp một số hàm, nhóm đọc lại và tự chịu trách nhiệm về kết quả. Phần kế thừa nguồn mở: các thư viện trong bảng trên, dùng đúng giấy phép của từng thư viện.</w:t>
       </w:r>
     </w:p>
     <w:p>
@@ -772,7 +772,7 @@
           <w:b w:val="0"/>
           <w:i w:val="0"/>
         </w:rPr>
-        <w:t>Để viết code, nhóm dùng Claude Code (386 câu lệnh) và GitHub Copilot (30 câu lệnh). Tụi em nhờ các công cụ này đọc hiểu mã nguồn, tìm lỗi và viết kiểm thử. Ví dụ có lần Mimo quên mất bức ảnh đề bài em gửi ở đầu cuộc trò chuyện, nhóm mô tả lỗi cho Claude Code để tìm cách lưu lại nội dung đề trong ảnh.</w:t>
+        <w:t>Để viết code, nhóm dùng Claude Code (405 câu lệnh) và GitHub Copilot (30 câu lệnh). Tụi em nhờ các công cụ này đọc hiểu mã nguồn, tìm lỗi và viết kiểm thử. Ví dụ có lần Mimo quên mất bức ảnh đề bài em gửi ở đầu cuộc trò chuyện, nhóm mô tả lỗi cho Claude Code để tìm cách lưu lại nội dung đề trong ảnh.</w:t>
       </w:r>
     </w:p>
     <w:p>
@@ -881,7 +881,7 @@
           <w:b w:val="0"/>
           <w:i w:val="0"/>
         </w:rPr>
-        <w:t>Toàn bộ 416 câu lệnh nhóm dùng với công cụ AI được lưu lại trong thư mục prompt-log (xem mục 8).</w:t>
+        <w:t>Toàn bộ 435 câu lệnh nhóm dùng với công cụ AI được lưu lại trong thư mục prompt-log (xem mục 8).</w:t>
       </w:r>
     </w:p>
     <w:p>
@@ -2291,7 +2291,7 @@
           <w:b w:val="0"/>
           <w:i w:val="0"/>
         </w:rPr>
-        <w:t>383 ca kiểm thử tự động của phần máy chủ đều đạt. Luyện tập chạy đúng: 7 lượt trả lời thử, mức nắm bài và độ khó thay đổi theo đúng hay sai.</w:t>
+        <w:t>387 ca kiểm thử tự động của phần máy chủ đều đạt. Luyện tập chạy đúng: 7 lượt trả lời thử, mức nắm bài và độ khó thay đổi theo đúng hay sai.</w:t>
       </w:r>
     </w:p>
     <w:p>
@@ -2364,7 +2364,7 @@
           <w:b w:val="0"/>
           <w:i w:val="0"/>
         </w:rPr>
-        <w:t>Ngay trong ngày nhóm sửa theo góp ý: câu hỏi kiểu “Có phải … không ạ?” thì Mimo nói rõ đúng hay chưa đúng và nêu ngay kiến thức đúng theo sách, có trích trang; khi giảng phân tích ra thừa số nguyên tố thì làm mẫu các phép chia liên tiếp như sách Toán 6 rồi để em làm tiếp. Bộ thử thêm điều kiện “phải có” cho các câu này để máy chấm cũng bắt được loại lỗi thầy cô chỉ ra. Lần đo lại sau khi sửa (17/10/2026, bảng ở trên) đạt 43/43.</w:t>
+        <w:t>Ngay trong ngày nhóm sửa theo góp ý: câu hỏi kiểu “Có phải … không ạ?” thì Mimo nói rõ đúng hay chưa đúng và nêu ngay kiến thức đúng theo sách, có trích trang; khi giảng phân tích ra thừa số nguyên tố thì làm mẫu các phép chia liên tiếp như sách Toán 6 rồi để em làm tiếp. Bộ thử thêm điều kiện “phải có” cho các câu này để máy chấm cũng bắt được loại lỗi thầy cô chỉ ra. Lần đo lại sau khi sửa (17/10/2026, bảng ở trên) đạt 43/43: câu 16 làm mẫu phép chia liên tiếp rồi để em tự phân tích 36; câu 27 nói rõ “chưa đúng”, nêu (A + B)² = A² + 2AB + B² và trích trang sách Toán 8.</w:t>
       </w:r>
     </w:p>
     <w:p>
@@ -2476,7 +2476,7 @@
           <w:b w:val="0"/>
           <w:i w:val="0"/>
         </w:rPr>
-        <w:t>Một nửa số câu Mimo trả lời xong trong khoảng 4,1 giây (nhanh nhất 0,2 giây, chậm nhất 5,6 giây). Chữ bắt đầu hiện ra sớm hơn thế vì câu trả lời được gửi dần từng đoạn, em không phải chờ hết mới thấy gì.</w:t>
+        <w:t>Một nửa số câu Mimo trả lời xong trong khoảng 3,8 giây (nhanh nhất 0,2 giây, chậm nhất 5,3 giây). Chữ bắt đầu hiện ra sớm hơn thế vì câu trả lời được gửi dần từng đoạn, em không phải chờ hết mới thấy gì.</w:t>
       </w:r>
     </w:p>
     <w:p>
@@ -3124,7 +3124,7 @@
           <w:b w:val="0"/>
           <w:i w:val="0"/>
         </w:rPr>
-        <w:t>File PROMPT_HISTORY.md ghi 416 câu lệnh (386 Claude Code, 30 GitHub Copilot), kèm thời gian từng câu.</w:t>
+        <w:t>File PROMPT_HISTORY.md ghi 435 câu lệnh (405 Claude Code, 30 GitHub Copilot), kèm thời gian từng câu.</w:t>
       </w:r>
     </w:p>
     <w:p>

</xml_diff>